<commit_message>
docs: add Yocto reference guide and update project tracking
</commit_message>
<xml_diff>
--- a/docs/architecture/project-progress-tracker.docx
+++ b/docs/architecture/project-progress-tracker.docx
@@ -5,6 +5,7 @@
     <w:p>
       <w:pPr>
         <w:pStyle w:val="Heading1"/>
+        <w:jc w:val="center"/>
       </w:pPr>
       <w:r>
         <w:t>Matter RPi Commissioning Project — Progress Tracker</w:t>
@@ -12,895 +13,345 @@
     </w:p>
     <w:p>
       <w:pPr>
-        <w:pStyle w:val="Heading1"/>
+        <w:pStyle w:val="Heading2"/>
       </w:pPr>
       <w:r>
-        <w:t>Matter RPi Commissioning Project — Progress Tracker</w:t>
-      </w:r>
-    </w:p>
-    <w:p/>
-    <w:p>
-      <w:r>
-        <w:t>_Last Updated: 2026-05-18 18:34 UTC_</w:t>
-      </w:r>
-    </w:p>
-    <w:p/>
-    <w:p>
-      <w:r>
-        <w:t>---</w:t>
-      </w:r>
-    </w:p>
-    <w:p/>
-    <w:p>
-      <w:pPr>
-        <w:pStyle w:val="Heading1"/>
-      </w:pPr>
-      <w:r>
-        <w:t>Purpose</w:t>
-      </w:r>
-    </w:p>
-    <w:p/>
-    <w:p>
-      <w:r>
-        <w:t>This document pairs with:</w:t>
+        <w:t>Last Updated</w:t>
       </w:r>
     </w:p>
     <w:p>
       <w:r>
-        <w:t>- `project-master-design.md`</w:t>
+        <w:t>2026-05-20</w:t>
       </w:r>
     </w:p>
-    <w:p>
-      <w:r>
-        <w:t>- `project-master-design.docx`</w:t>
-      </w:r>
-    </w:p>
-    <w:p/>
-    <w:p>
-      <w:r>
-        <w:t>It tracks:</w:t>
-      </w:r>
-    </w:p>
-    <w:p>
-      <w:r>
-        <w:t>- completed milestones</w:t>
-      </w:r>
-    </w:p>
-    <w:p>
-      <w:r>
-        <w:t>- current status</w:t>
-      </w:r>
-    </w:p>
-    <w:p>
-      <w:r>
-        <w:t>- pending tasks</w:t>
-      </w:r>
-    </w:p>
-    <w:p>
-      <w:r>
-        <w:t>- engineering decisions</w:t>
-      </w:r>
-    </w:p>
-    <w:p>
-      <w:r>
-        <w:t>- setup state</w:t>
-      </w:r>
-    </w:p>
-    <w:p>
-      <w:r>
-        <w:t>- future blockers</w:t>
-      </w:r>
-    </w:p>
-    <w:p/>
-    <w:p>
-      <w:r>
-        <w:t>---</w:t>
-      </w:r>
-    </w:p>
-    <w:p/>
-    <w:p>
-      <w:pPr>
-        <w:pStyle w:val="Heading1"/>
-      </w:pPr>
-      <w:r>
-        <w:t>Overall Project Status</w:t>
-      </w:r>
-    </w:p>
-    <w:p/>
-    <w:p>
-      <w:r>
-        <w:t>| Area | Status |</w:t>
-      </w:r>
-    </w:p>
-    <w:p>
-      <w:r>
-        <w:t>|---|---|</w:t>
-      </w:r>
-    </w:p>
-    <w:p>
-      <w:r>
-        <w:t>| Project vision defined | COMPLETE |</w:t>
-      </w:r>
-    </w:p>
-    <w:p>
-      <w:r>
-        <w:t>| Hardware inventory complete | COMPLETE |</w:t>
-      </w:r>
-    </w:p>
-    <w:p>
-      <w:r>
-        <w:t>| Repository created | COMPLETE |</w:t>
-      </w:r>
-    </w:p>
-    <w:p>
-      <w:r>
-        <w:t>| Git workflow configured | COMPLETE |</w:t>
-      </w:r>
-    </w:p>
-    <w:p>
-      <w:r>
-        <w:t>| SSH authentication setup | COMPLETE |</w:t>
-      </w:r>
-    </w:p>
-    <w:p>
-      <w:r>
-        <w:t>| VS Code workspace setup | COMPLETE |</w:t>
-      </w:r>
-    </w:p>
-    <w:p>
-      <w:r>
-        <w:t>| Initial documentation structure | COMPLETE |</w:t>
-      </w:r>
-    </w:p>
-    <w:p>
-      <w:r>
-        <w:t>| Yocto direction finalized | COMPLETE |</w:t>
-      </w:r>
-    </w:p>
-    <w:p>
-      <w:r>
-        <w:t>| Yocto host dependency installation | COMPLETE |</w:t>
-      </w:r>
-    </w:p>
-    <w:p>
-      <w:r>
-        <w:t>| Locale configuration | IN PROGRESS |</w:t>
-      </w:r>
-    </w:p>
-    <w:p>
-      <w:r>
-        <w:t>| Yocto source setup | NOT STARTED |</w:t>
-      </w:r>
-    </w:p>
-    <w:p>
-      <w:r>
-        <w:t>| Yocto image build | NOT STARTED |</w:t>
-      </w:r>
-    </w:p>
-    <w:p>
-      <w:r>
-        <w:t>| Raspberry Pi bring-up | NOT STARTED |</w:t>
-      </w:r>
-    </w:p>
-    <w:p>
-      <w:r>
-        <w:t>| Matter integration | NOT STARTED |</w:t>
-      </w:r>
-    </w:p>
-    <w:p>
-      <w:r>
-        <w:t>| Kernel programming integration | PLANNED |</w:t>
-      </w:r>
-    </w:p>
-    <w:p/>
-    <w:p>
-      <w:r>
-        <w:t>---</w:t>
-      </w:r>
-    </w:p>
-    <w:p/>
-    <w:p>
-      <w:pPr>
-        <w:pStyle w:val="Heading1"/>
-      </w:pPr>
-      <w:r>
-        <w:t>Current Architecture Decisions</w:t>
-      </w:r>
-    </w:p>
-    <w:p/>
     <w:p>
       <w:pPr>
         <w:pStyle w:val="Heading2"/>
       </w:pPr>
       <w:r>
-        <w:t>Commissioner</w:t>
+        <w:t>Current Strategic Structure</w:t>
       </w:r>
     </w:p>
     <w:p>
       <w:r>
-        <w:t>- Raspberry Pi 5</w:t>
+        <w:t>The project now officially follows a parallel engineering workflow.</w:t>
+        <w:br/>
+        <w:br/>
+        <w:t>Main Thread Responsibilities:</w:t>
+        <w:br/>
+        <w:t>- architecture</w:t>
+        <w:br/>
+        <w:t>- integration</w:t>
+        <w:br/>
+        <w:t>- roadmap</w:t>
+        <w:br/>
+        <w:t>- milestone coordination</w:t>
+        <w:br/>
+        <w:br/>
+        <w:t>Dedicated Yocto Thread Responsibilities:</w:t>
+        <w:br/>
+        <w:t>- Poky</w:t>
+        <w:br/>
+        <w:t>- BitBake</w:t>
+        <w:br/>
+        <w:t>- BSP layers</w:t>
+        <w:br/>
+        <w:t>- MACHINE configuration</w:t>
+        <w:br/>
+        <w:t>- image generation</w:t>
+        <w:br/>
+        <w:t>- Yocto debugging</w:t>
+        <w:br/>
+        <w:br/>
+        <w:t>Future Dedicated Threads:</w:t>
+        <w:br/>
+        <w:t>- Matter internals</w:t>
+        <w:br/>
+        <w:t>- kernel and drivers</w:t>
+        <w:br/>
+        <w:t>- networking and BLE</w:t>
+        <w:br/>
+        <w:t>- CI/CD and automation</w:t>
+        <w:br/>
+        <w:t>- testing and Coverity</w:t>
+        <w:br/>
+        <w:t>- documentation and diagrams</w:t>
       </w:r>
     </w:p>
-    <w:p>
-      <w:r>
-        <w:t>- Matter Commissioner</w:t>
-      </w:r>
-    </w:p>
-    <w:p>
-      <w:r>
-        <w:t>- Standard Linux initially</w:t>
-      </w:r>
-    </w:p>
-    <w:p>
-      <w:r>
-        <w:t>- chip-tool</w:t>
-      </w:r>
-    </w:p>
-    <w:p>
-      <w:r>
-        <w:t>- BLE + Wi-Fi</w:t>
-      </w:r>
-    </w:p>
-    <w:p/>
     <w:p>
       <w:pPr>
         <w:pStyle w:val="Heading2"/>
       </w:pPr>
       <w:r>
-        <w:t>Accessory</w:t>
+        <w:t>Yocto Progress Snapshot</w:t>
       </w:r>
     </w:p>
     <w:p>
       <w:r>
-        <w:t>- Raspberry Pi 3</w:t>
+        <w:t>Completed:</w:t>
+        <w:br/>
+        <w:t>- host dependency installation</w:t>
+        <w:br/>
+        <w:t>- locale configuration</w:t>
+        <w:br/>
+        <w:t>- workspace creation</w:t>
+        <w:br/>
+        <w:t>- Poky clone</w:t>
+        <w:br/>
+        <w:t>- meta-raspberrypi clone</w:t>
+        <w:br/>
+        <w:t>- meta-openembedded clone</w:t>
+        <w:br/>
+        <w:t>- build environment initialization</w:t>
+        <w:br/>
+        <w:t>- MACHINE set to raspberrypi3</w:t>
+        <w:br/>
+        <w:t>- bblayers.conf configuration</w:t>
+        <w:br/>
+        <w:t>- relative-path layer architecture adoption</w:t>
+        <w:br/>
+        <w:t>- local.conf hardening</w:t>
+        <w:br/>
+        <w:t>- package management enablement</w:t>
+        <w:br/>
+        <w:t>- SSH + debug feature configuration</w:t>
+        <w:br/>
+        <w:t>- systemd integration</w:t>
+        <w:br/>
+        <w:t>- development/debug tooling setup</w:t>
+        <w:br/>
+        <w:t>- shared downloads cache setup</w:t>
+        <w:br/>
+        <w:t>- shared sstate-cache setup</w:t>
+        <w:br/>
+        <w:br/>
+        <w:t>Pending:</w:t>
+        <w:br/>
+        <w:t>- UART enablement</w:t>
+        <w:br/>
+        <w:t>- layer validation</w:t>
+        <w:br/>
+        <w:t>- first BitBake validation</w:t>
+        <w:br/>
+        <w:t>- first image build</w:t>
+        <w:br/>
+        <w:t>- Raspberry Pi boot validation</w:t>
       </w:r>
     </w:p>
-    <w:p>
-      <w:r>
-        <w:t>- Matter Accessory</w:t>
-      </w:r>
-    </w:p>
-    <w:p>
-      <w:r>
-        <w:t>- Yocto Linux</w:t>
-      </w:r>
-    </w:p>
-    <w:p>
-      <w:r>
-        <w:t>- lighting-app</w:t>
-      </w:r>
-    </w:p>
-    <w:p>
-      <w:r>
-        <w:t>- Future GPIO integration</w:t>
-      </w:r>
-    </w:p>
-    <w:p>
-      <w:r>
-        <w:t>- Future kernel driver</w:t>
-      </w:r>
-    </w:p>
-    <w:p/>
-    <w:p>
-      <w:r>
-        <w:t>---</w:t>
-      </w:r>
-    </w:p>
-    <w:p/>
-    <w:p>
-      <w:pPr>
-        <w:pStyle w:val="Heading1"/>
-      </w:pPr>
-      <w:r>
-        <w:t>Development Environment Status</w:t>
-      </w:r>
-    </w:p>
-    <w:p/>
     <w:p>
       <w:pPr>
         <w:pStyle w:val="Heading2"/>
       </w:pPr>
       <w:r>
-        <w:t>Host Machine</w:t>
+        <w:t>Important Engineering Decisions</w:t>
       </w:r>
     </w:p>
     <w:p>
       <w:r>
-        <w:t>- Ubuntu 22 ThinkPad</w:t>
+        <w:t>Selected Yocto Release:</w:t>
+        <w:br/>
+        <w:t>- Kirkstone LTS</w:t>
+        <w:br/>
+        <w:br/>
+        <w:t>Reason:</w:t>
+        <w:br/>
+        <w:t>- long-term support</w:t>
+        <w:br/>
+        <w:t>- stable ecosystem</w:t>
+        <w:br/>
+        <w:t>- mature Raspberry Pi support</w:t>
+        <w:br/>
+        <w:br/>
+        <w:t>Selected Init System:</w:t>
+        <w:br/>
+        <w:t>- systemd</w:t>
+        <w:br/>
+        <w:br/>
+        <w:t>Reason:</w:t>
+        <w:br/>
+        <w:t>- modern service management</w:t>
+        <w:br/>
+        <w:t>- better Matter/Linux integration</w:t>
+        <w:br/>
+        <w:t>- improved debugging and supervision</w:t>
+        <w:br/>
+        <w:br/>
+        <w:t>Layer Path Strategy:</w:t>
+        <w:br/>
+        <w:t>- relative paths instead of hardcoded absolute paths</w:t>
+        <w:br/>
+        <w:br/>
+        <w:t>Reason:</w:t>
+        <w:br/>
+        <w:t>- portability</w:t>
+        <w:br/>
+        <w:t>- CI/CD friendliness</w:t>
+        <w:br/>
+        <w:t>- reproducibility</w:t>
+        <w:br/>
+        <w:t>- team scalability</w:t>
       </w:r>
     </w:p>
-    <w:p>
-      <w:r>
-        <w:t>- VS Code ready</w:t>
-      </w:r>
-    </w:p>
-    <w:p>
-      <w:r>
-        <w:t>- Git ready</w:t>
-      </w:r>
-    </w:p>
-    <w:p>
-      <w:r>
-        <w:t>- SSH configured</w:t>
-      </w:r>
-    </w:p>
-    <w:p>
-      <w:r>
-        <w:t>- GitHub SSH auth working</w:t>
-      </w:r>
-    </w:p>
-    <w:p>
-      <w:r>
-        <w:t>- Workspace initialized</w:t>
-      </w:r>
-    </w:p>
-    <w:p/>
-    <w:p>
-      <w:r>
-        <w:t>---</w:t>
-      </w:r>
-    </w:p>
-    <w:p/>
-    <w:p>
-      <w:pPr>
-        <w:pStyle w:val="Heading1"/>
-      </w:pPr>
-      <w:r>
-        <w:t>Repository Status</w:t>
-      </w:r>
-    </w:p>
-    <w:p/>
-    <w:p>
-      <w:r>
-        <w:t>Repository:</w:t>
-      </w:r>
-    </w:p>
-    <w:p>
-      <w:r>
-        <w:t>`matter-rpi-commissioning`</w:t>
-      </w:r>
-    </w:p>
-    <w:p/>
-    <w:p>
-      <w:r>
-        <w:t>---</w:t>
-      </w:r>
-    </w:p>
-    <w:p/>
-    <w:p>
-      <w:pPr>
-        <w:pStyle w:val="Heading1"/>
-      </w:pPr>
-      <w:r>
-        <w:t>Git Workflow Status</w:t>
-      </w:r>
-    </w:p>
-    <w:p/>
-    <w:p>
-      <w:r>
-        <w:t>Completed:</w:t>
-      </w:r>
-    </w:p>
-    <w:p>
-      <w:r>
-        <w:t>- SSH key generated</w:t>
-      </w:r>
-    </w:p>
-    <w:p>
-      <w:r>
-        <w:t>- SSH key added to GitHub</w:t>
-      </w:r>
-    </w:p>
-    <w:p>
-      <w:r>
-        <w:t>- SSH authentication verified</w:t>
-      </w:r>
-    </w:p>
-    <w:p>
-      <w:r>
-        <w:t>- Remote switched to SSH</w:t>
-      </w:r>
-    </w:p>
-    <w:p>
-      <w:r>
-        <w:t>- Initial commits pushed</w:t>
-      </w:r>
-    </w:p>
-    <w:p/>
-    <w:p>
-      <w:r>
-        <w:t>Commit convention:</w:t>
-      </w:r>
-    </w:p>
-    <w:p>
-      <w:r>
-        <w:t>- chore:</w:t>
-      </w:r>
-    </w:p>
-    <w:p>
-      <w:r>
-        <w:t>- feat:</w:t>
-      </w:r>
-    </w:p>
-    <w:p>
-      <w:r>
-        <w:t>- fix:</w:t>
-      </w:r>
-    </w:p>
-    <w:p>
-      <w:r>
-        <w:t>- docs:</w:t>
-      </w:r>
-    </w:p>
-    <w:p>
-      <w:r>
-        <w:t>- build:</w:t>
-      </w:r>
-    </w:p>
-    <w:p/>
-    <w:p>
-      <w:r>
-        <w:t>---</w:t>
-      </w:r>
-    </w:p>
-    <w:p/>
-    <w:p>
-      <w:pPr>
-        <w:pStyle w:val="Heading1"/>
-      </w:pPr>
-      <w:r>
-        <w:t>Documentation Status</w:t>
-      </w:r>
-    </w:p>
-    <w:p/>
-    <w:p>
-      <w:r>
-        <w:t>Existing documents:</w:t>
-      </w:r>
-    </w:p>
-    <w:p>
-      <w:r>
-        <w:t>- Master design document</w:t>
-      </w:r>
-    </w:p>
-    <w:p>
-      <w:r>
-        <w:t>- Progress tracker</w:t>
-      </w:r>
-    </w:p>
-    <w:p>
-      <w:r>
-        <w:t>- README initialized</w:t>
-      </w:r>
-    </w:p>
-    <w:p>
-      <w:r>
-        <w:t>- Journal initialized</w:t>
-      </w:r>
-    </w:p>
-    <w:p/>
-    <w:p>
-      <w:r>
-        <w:t>---</w:t>
-      </w:r>
-    </w:p>
-    <w:p/>
-    <w:p>
-      <w:pPr>
-        <w:pStyle w:val="Heading1"/>
-      </w:pPr>
-      <w:r>
-        <w:t>Yocto Strategy</w:t>
-      </w:r>
-    </w:p>
-    <w:p/>
-    <w:p>
-      <w:r>
-        <w:t>- Yocto Release: Kirkstone LTS</w:t>
-      </w:r>
-    </w:p>
-    <w:p>
-      <w:r>
-        <w:t>- BSP Layer: meta-raspberrypi</w:t>
-      </w:r>
-    </w:p>
-    <w:p>
-      <w:r>
-        <w:t>- Build Host: Ubuntu 22 ThinkPad</w:t>
-      </w:r>
-    </w:p>
-    <w:p>
-      <w:r>
-        <w:t>- Target Device: Raspberry Pi 3</w:t>
-      </w:r>
-    </w:p>
-    <w:p/>
-    <w:p>
-      <w:r>
-        <w:t>---</w:t>
-      </w:r>
-    </w:p>
-    <w:p/>
-    <w:p>
-      <w:pPr>
-        <w:pStyle w:val="Heading1"/>
-      </w:pPr>
-      <w:r>
-        <w:t>Yocto Setup Progress</w:t>
-      </w:r>
-    </w:p>
-    <w:p/>
-    <w:p>
-      <w:r>
-        <w:t>Completed:</w:t>
-      </w:r>
-    </w:p>
-    <w:p>
-      <w:r>
-        <w:t>- Host dependency installation</w:t>
-      </w:r>
-    </w:p>
-    <w:p/>
-    <w:p>
-      <w:r>
-        <w:t>Current step:</w:t>
-      </w:r>
-    </w:p>
-    <w:p>
-      <w:r>
-        <w:t>- Locale configuration</w:t>
-      </w:r>
-    </w:p>
-    <w:p/>
-    <w:p>
-      <w:r>
-        <w:t>Commands executed:</w:t>
-      </w:r>
-    </w:p>
-    <w:p/>
-    <w:p>
-      <w:r>
-        <w:t>```bash</w:t>
-      </w:r>
-    </w:p>
-    <w:p>
-      <w:r>
-        <w:t>sudo locale-gen en_US.UTF-8</w:t>
-      </w:r>
-    </w:p>
-    <w:p>
-      <w:r>
-        <w:t>export LANG=en_US.UTF-8</w:t>
-      </w:r>
-    </w:p>
-    <w:p>
-      <w:r>
-        <w:t>export LC_ALL=en_US.UTF-8</w:t>
-      </w:r>
-    </w:p>
-    <w:p>
-      <w:r>
-        <w:t>```</w:t>
-      </w:r>
-    </w:p>
-    <w:p/>
-    <w:p>
-      <w:r>
-        <w:t>---</w:t>
-      </w:r>
-    </w:p>
-    <w:p/>
-    <w:p>
-      <w:pPr>
-        <w:pStyle w:val="Heading1"/>
-      </w:pPr>
-      <w:r>
-        <w:t>Planned Next Steps</w:t>
-      </w:r>
-    </w:p>
-    <w:p/>
-    <w:p>
-      <w:r>
-        <w:t>1. Verify locale configuration</w:t>
-      </w:r>
-    </w:p>
-    <w:p>
-      <w:r>
-        <w:t>2. Create Yocto source directory</w:t>
-      </w:r>
-    </w:p>
-    <w:p>
-      <w:r>
-        <w:t>3. Clone Poky</w:t>
-      </w:r>
-    </w:p>
-    <w:p>
-      <w:r>
-        <w:t>4. Clone meta-raspberrypi</w:t>
-      </w:r>
-    </w:p>
-    <w:p>
-      <w:r>
-        <w:t>5. Clone meta-openembedded</w:t>
-      </w:r>
-    </w:p>
-    <w:p>
-      <w:r>
-        <w:t>6. Initialize build environment</w:t>
-      </w:r>
-    </w:p>
-    <w:p>
-      <w:r>
-        <w:t>7. Configure MACHINE</w:t>
-      </w:r>
-    </w:p>
-    <w:p>
-      <w:r>
-        <w:t>8. Build first image</w:t>
-      </w:r>
-    </w:p>
-    <w:p/>
-    <w:p>
-      <w:r>
-        <w:t>---</w:t>
-      </w:r>
-    </w:p>
-    <w:p/>
-    <w:p>
-      <w:pPr>
-        <w:pStyle w:val="Heading1"/>
-      </w:pPr>
-      <w:r>
-        <w:t>Future Planned Features</w:t>
-      </w:r>
-    </w:p>
-    <w:p/>
     <w:p>
       <w:pPr>
         <w:pStyle w:val="Heading2"/>
       </w:pPr>
       <w:r>
-        <w:t>Matter</w:t>
+        <w:t>Current Yocto Workspace Structure</w:t>
       </w:r>
     </w:p>
     <w:p>
       <w:r>
-        <w:t>- BLE commissioning</w:t>
+        <w:t>yocto/</w:t>
+        <w:br/>
+        <w:t>├── downloads/</w:t>
+        <w:br/>
+        <w:t>├── sstate-cache/</w:t>
+        <w:br/>
+        <w:t>└── sources/</w:t>
+        <w:br/>
+        <w:t xml:space="preserve">    ├── poky/</w:t>
+        <w:br/>
+        <w:t xml:space="preserve">    ├── meta-raspberrypi/</w:t>
+        <w:br/>
+        <w:t xml:space="preserve">    └── meta-openembedded/</w:t>
       </w:r>
     </w:p>
-    <w:p>
-      <w:r>
-        <w:t>- Wi-Fi operational transport</w:t>
-      </w:r>
-    </w:p>
-    <w:p>
-      <w:r>
-        <w:t>- CASE/PASE flows</w:t>
-      </w:r>
-    </w:p>
-    <w:p/>
     <w:p>
       <w:pPr>
         <w:pStyle w:val="Heading2"/>
       </w:pPr>
       <w:r>
-        <w:t>Embedded Linux</w:t>
+        <w:t>Current Active Yocto Layers</w:t>
       </w:r>
     </w:p>
     <w:p>
       <w:r>
-        <w:t>- Custom Yocto image</w:t>
+        <w:t>- meta</w:t>
+        <w:br/>
+        <w:t>- meta-poky</w:t>
+        <w:br/>
+        <w:t>- meta-yocto-bsp</w:t>
+        <w:br/>
+        <w:t>- meta-raspberrypi</w:t>
+        <w:br/>
+        <w:t>- meta-oe</w:t>
+        <w:br/>
+        <w:t>- meta-python</w:t>
+        <w:br/>
+        <w:t>- meta-networking</w:t>
       </w:r>
     </w:p>
-    <w:p>
-      <w:r>
-        <w:t>- systemd integration</w:t>
-      </w:r>
-    </w:p>
-    <w:p>
-      <w:r>
-        <w:t>- BlueZ integration</w:t>
-      </w:r>
-    </w:p>
-    <w:p/>
     <w:p>
       <w:pPr>
         <w:pStyle w:val="Heading2"/>
       </w:pPr>
       <w:r>
-        <w:t>Kernel Development</w:t>
+        <w:t>Current local.conf Engineering Features</w:t>
       </w:r>
     </w:p>
     <w:p>
       <w:r>
-        <w:t>- Character device driver</w:t>
+        <w:t>Enabled:</w:t>
+        <w:br/>
+        <w:t>- parallel builds</w:t>
+        <w:br/>
+        <w:t>- RPM package generation</w:t>
+        <w:br/>
+        <w:t>- package-management support</w:t>
+        <w:br/>
+        <w:t>- OpenSSH server</w:t>
+        <w:br/>
+        <w:t>- debug-tweaks</w:t>
+        <w:br/>
+        <w:t>- systemd</w:t>
+        <w:br/>
+        <w:t>- development packages</w:t>
+        <w:br/>
+        <w:t>- debug tooling</w:t>
+        <w:br/>
+        <w:t>- shared download cache</w:t>
+        <w:br/>
+        <w:t>- shared sstate cache</w:t>
+        <w:br/>
+        <w:br/>
+        <w:t>Installed Development Tools:</w:t>
+        <w:br/>
+        <w:t>- git</w:t>
+        <w:br/>
+        <w:t>- cmake</w:t>
+        <w:br/>
+        <w:t>- ninja</w:t>
+        <w:br/>
+        <w:t>- gdb</w:t>
+        <w:br/>
+        <w:t>- gdbserver</w:t>
+        <w:br/>
+        <w:t>- strace</w:t>
+        <w:br/>
+        <w:t>- ltrace</w:t>
+        <w:br/>
+        <w:t>- vim</w:t>
+        <w:br/>
+        <w:t>- bash</w:t>
+      </w:r>
+    </w:p>
+    <w:p>
+      <w:pPr>
+        <w:pStyle w:val="Heading2"/>
+      </w:pPr>
+      <w:r>
+        <w:t>Near-Term Milestones</w:t>
       </w:r>
     </w:p>
     <w:p>
       <w:r>
-        <w:t>- GPIO module</w:t>
+        <w:t>1. Enable UART console</w:t>
+        <w:br/>
+        <w:t>2. Validate Yocto layer stack</w:t>
+        <w:br/>
+        <w:t>3. Perform first BitBake validation</w:t>
+        <w:br/>
+        <w:t>4. Build first core-image-minimal image</w:t>
+        <w:br/>
+        <w:t>5. Validate Raspberry Pi boot</w:t>
+        <w:br/>
+        <w:t>6. Create custom development image</w:t>
+        <w:br/>
+        <w:t>7. Begin Matter dependency integration</w:t>
+      </w:r>
+    </w:p>
+    <w:p>
+      <w:pPr>
+        <w:pStyle w:val="Heading2"/>
+      </w:pPr>
+      <w:r>
+        <w:t>Long-Term Planned Work</w:t>
       </w:r>
     </w:p>
     <w:p>
       <w:r>
-        <w:t>- Device tree overlays</w:t>
-      </w:r>
-    </w:p>
-    <w:p>
-      <w:r>
-        <w:t>- /dev/matter_led</w:t>
-      </w:r>
-    </w:p>
-    <w:p/>
-    <w:p>
-      <w:r>
-        <w:t>---</w:t>
-      </w:r>
-    </w:p>
-    <w:p/>
-    <w:p>
-      <w:pPr>
-        <w:pStyle w:val="Heading1"/>
-      </w:pPr>
-      <w:r>
-        <w:t>Current Milestone</w:t>
-      </w:r>
-    </w:p>
-    <w:p/>
-    <w:p>
-      <w:r>
-        <w:t>Phase 1 — Yocto Platform Bring-up</w:t>
-      </w:r>
-    </w:p>
-    <w:p/>
-    <w:p>
-      <w:r>
-        <w:t>Goal:</w:t>
-      </w:r>
-    </w:p>
-    <w:p/>
-    <w:p>
-      <w:r>
-        <w:t>Boot custom Yocto image on Raspberry Pi 3 with:</w:t>
-      </w:r>
-    </w:p>
-    <w:p>
-      <w:r>
-        <w:t>- SSH</w:t>
-      </w:r>
-    </w:p>
-    <w:p>
-      <w:r>
-        <w:t>- Wi-Fi</w:t>
-      </w:r>
-    </w:p>
-    <w:p>
-      <w:r>
-        <w:t>- BLE</w:t>
-      </w:r>
-    </w:p>
-    <w:p>
-      <w:r>
-        <w:t>working.</w:t>
-      </w:r>
-    </w:p>
-    <w:p/>
-    <w:p>
-      <w:r>
-        <w:t>---</w:t>
-      </w:r>
-    </w:p>
-    <w:p/>
-    <w:p>
-      <w:pPr>
-        <w:pStyle w:val="Heading1"/>
-      </w:pPr>
-      <w:r>
-        <w:t>Engineering Philosophy</w:t>
-      </w:r>
-    </w:p>
-    <w:p/>
-    <w:p>
-      <w:r>
-        <w:t>Prioritize:</w:t>
-      </w:r>
-    </w:p>
-    <w:p>
-      <w:r>
-        <w:t>- deep understanding</w:t>
-      </w:r>
-    </w:p>
-    <w:p>
-      <w:r>
-        <w:t>- embedded Linux engineering</w:t>
-      </w:r>
-    </w:p>
-    <w:p>
-      <w:r>
-        <w:t>- architecture clarity</w:t>
-      </w:r>
-    </w:p>
-    <w:p>
-      <w:r>
-        <w:t>- reproducibility</w:t>
-      </w:r>
-    </w:p>
-    <w:p>
-      <w:r>
-        <w:t>- systems learning</w:t>
-      </w:r>
-    </w:p>
-    <w:p/>
-    <w:p>
-      <w:r>
-        <w:t>Avoid:</w:t>
-      </w:r>
-    </w:p>
-    <w:p>
-      <w:r>
-        <w:t>- shortcuts</w:t>
-      </w:r>
-    </w:p>
-    <w:p>
-      <w:r>
-        <w:t>- copy-paste workflows</w:t>
-      </w:r>
-    </w:p>
-    <w:p>
-      <w:r>
-        <w:t>- shallow demos</w:t>
-      </w:r>
-    </w:p>
-    <w:p/>
-    <w:p>
-      <w:r>
-        <w:t>---</w:t>
-      </w:r>
-    </w:p>
-    <w:p/>
-    <w:p>
-      <w:pPr>
-        <w:pStyle w:val="Heading1"/>
-      </w:pPr>
-      <w:r>
-        <w:t>Notes for Future Chats</w:t>
-      </w:r>
-    </w:p>
-    <w:p/>
-    <w:p>
-      <w:r>
-        <w:t>This document should be supplied together with:</w:t>
-      </w:r>
-    </w:p>
-    <w:p>
-      <w:r>
-        <w:t>- `project-master-design.md`</w:t>
-      </w:r>
-    </w:p>
-    <w:p/>
-    <w:p>
-      <w:r>
-        <w:t>to preserve:</w:t>
-      </w:r>
-    </w:p>
-    <w:p>
-      <w:r>
-        <w:t>- project state</w:t>
-      </w:r>
-    </w:p>
-    <w:p>
-      <w:r>
-        <w:t>- architectural continuity</w:t>
-      </w:r>
-    </w:p>
-    <w:p>
-      <w:r>
-        <w:t>- engineering decisions</w:t>
-      </w:r>
-    </w:p>
-    <w:p>
-      <w:r>
-        <w:t>- workflow context</w:t>
+        <w:t>- custom Yocto layer</w:t>
+        <w:br/>
+        <w:t>- Matter integration</w:t>
+        <w:br/>
+        <w:t>- GPIO support</w:t>
+        <w:br/>
+        <w:t>- kernel modules</w:t>
+        <w:br/>
+        <w:t>- gtest integration</w:t>
+        <w:br/>
+        <w:t>- Coverity integration</w:t>
+        <w:br/>
+        <w:t>- reproducible setup scripts</w:t>
+        <w:br/>
+        <w:t>- CI/CD pipelines</w:t>
+        <w:br/>
+        <w:t>- production image hardening</w:t>
+        <w:br/>
+        <w:t>- OTA strategy</w:t>
+        <w:br/>
+        <w:t>- security hardening</w:t>
       </w:r>
     </w:p>
     <w:sectPr>
@@ -1277,7 +728,7 @@
     <w:qFormat/>
     <w:rsid w:val="00FC693F"/>
     <w:rPr>
-      <w:sz w:val="20"/>
+      <w:sz w:val="22"/>
     </w:rPr>
   </w:style>
   <w:style w:type="paragraph" w:styleId="Header">

</xml_diff>